<commit_message>
This is my contribution file.
   Finalized the reward buttons by using HTML and JavaScript
</commit_message>
<xml_diff>
--- a/Week2/Prototype-Start/Individual Contribution-log/Contribution Log.docx
+++ b/Week2/Prototype-Start/Individual Contribution-log/Contribution Log.docx
@@ -4,40 +4,112 @@
   <w:body>
     <w:p>
       <w:pPr>
+        <w:rPr>
+          <w:sz w:val="20"/>
+          <w:szCs w:val="20"/>
+        </w:rPr>
+      </w:pPr>
+      <w:r>
+        <w:rPr>
+          <w:sz w:val="20"/>
+          <w:szCs w:val="20"/>
+        </w:rPr>
+        <w:t>Contribution Lo</w:t>
+      </w:r>
+      <w:r>
+        <w:rPr>
+          <w:sz w:val="20"/>
+          <w:szCs w:val="20"/>
+        </w:rPr>
+        <w:t>g</w:t>
+      </w:r>
+    </w:p>
+    <w:p>
+      <w:pPr>
+        <w:rPr>
+          <w:sz w:val="20"/>
+          <w:szCs w:val="20"/>
+        </w:rPr>
+      </w:pPr>
+      <w:r>
+        <w:rPr>
+          <w:sz w:val="20"/>
+          <w:szCs w:val="20"/>
+        </w:rPr>
+        <w:t xml:space="preserve">Name: </w:t>
+      </w:r>
+      <w:r>
+        <w:rPr>
+          <w:sz w:val="20"/>
+          <w:szCs w:val="20"/>
+        </w:rPr>
+        <w:t>Priksha Rawat</w:t>
+      </w:r>
+    </w:p>
+    <w:p>
+      <w:pPr>
+        <w:rPr>
+          <w:sz w:val="20"/>
+          <w:szCs w:val="20"/>
+        </w:rPr>
+      </w:pPr>
+      <w:r>
+        <w:rPr>
+          <w:sz w:val="20"/>
+          <w:szCs w:val="20"/>
+        </w:rPr>
+        <w:t xml:space="preserve">GitHub </w:t>
+      </w:r>
+      <w:r>
+        <w:rPr>
+          <w:sz w:val="20"/>
+          <w:szCs w:val="20"/>
+        </w:rPr>
+        <w:t>Username:</w:t>
+      </w:r>
+      <w:r>
+        <w:rPr>
+          <w:sz w:val="20"/>
+          <w:szCs w:val="20"/>
+        </w:rPr>
+        <w:t xml:space="preserve"> Priksha Rawat</w:t>
+      </w:r>
+    </w:p>
+    <w:p>
+      <w:pPr>
         <w:pStyle w:val="ListParagraph"/>
         <w:numPr>
           <w:ilvl w:val="0"/>
           <w:numId w:val="1"/>
         </w:numPr>
+        <w:rPr>
+          <w:sz w:val="20"/>
+          <w:szCs w:val="20"/>
+        </w:rPr>
       </w:pPr>
       <w:r>
-        <w:t>Contribution Log</w:t>
-      </w:r>
-    </w:p>
-    <w:p/>
-    <w:p>
-      <w:r>
-        <w:t xml:space="preserve">Name: </w:t>
-      </w:r>
-      <w:r>
-        <w:t xml:space="preserve"> Misha Tamang  </w:t>
+        <w:rPr>
+          <w:sz w:val="20"/>
+          <w:szCs w:val="20"/>
+        </w:rPr>
+        <w:t>What I worked on</w:t>
       </w:r>
     </w:p>
     <w:p>
+      <w:pPr>
+        <w:rPr>
+          <w:sz w:val="20"/>
+          <w:szCs w:val="20"/>
+        </w:rPr>
+      </w:pPr>
       <w:r>
-        <w:t xml:space="preserve">GitHub </w:t>
-      </w:r>
-      <w:r>
-        <w:t xml:space="preserve">Username: </w:t>
-      </w:r>
-      <w:r>
-        <w:t xml:space="preserve"> </w:t>
-      </w:r>
-      <w:r>
-        <w:t>Misha Tamang</w:t>
+        <w:rPr>
+          <w:sz w:val="20"/>
+          <w:szCs w:val="20"/>
+        </w:rPr>
+        <w:t xml:space="preserve">                   Finalized the reward buttons by using HTML and JavaScript </w:t>
       </w:r>
     </w:p>
-    <w:p/>
     <w:p>
       <w:pPr>
         <w:pStyle w:val="ListParagraph"/>
@@ -45,17 +117,41 @@
           <w:ilvl w:val="0"/>
           <w:numId w:val="1"/>
         </w:numPr>
+        <w:rPr>
+          <w:sz w:val="20"/>
+          <w:szCs w:val="20"/>
+        </w:rPr>
       </w:pPr>
       <w:r>
-        <w:t>What I worked on</w:t>
+        <w:rPr>
+          <w:sz w:val="20"/>
+          <w:szCs w:val="20"/>
+        </w:rPr>
+        <w:t>What I learned</w:t>
       </w:r>
     </w:p>
     <w:p>
+      <w:pPr>
+        <w:rPr>
+          <w:sz w:val="20"/>
+          <w:szCs w:val="20"/>
+        </w:rPr>
+      </w:pPr>
       <w:r>
-        <w:t>Created and added a button feature using HTML and JavaScript.</w:t>
+        <w:rPr>
+          <w:sz w:val="20"/>
+          <w:szCs w:val="20"/>
+        </w:rPr>
+        <w:t xml:space="preserve">                  </w:t>
+      </w:r>
+      <w:r>
+        <w:rPr>
+          <w:sz w:val="20"/>
+          <w:szCs w:val="20"/>
+        </w:rPr>
+        <w:t>How JavaScript buttons work</w:t>
       </w:r>
     </w:p>
-    <w:p/>
     <w:p>
       <w:pPr>
         <w:pStyle w:val="ListParagraph"/>
@@ -63,38 +159,38 @@
           <w:ilvl w:val="0"/>
           <w:numId w:val="1"/>
         </w:numPr>
+        <w:rPr>
+          <w:sz w:val="20"/>
+          <w:szCs w:val="20"/>
+        </w:rPr>
       </w:pPr>
       <w:r>
-        <w:t>What I learned</w:t>
-      </w:r>
-    </w:p>
-    <w:p>
-      <w:r>
-        <w:t>Learned how buttons work and how to connect them with JavaScript functions.</w:t>
-      </w:r>
-    </w:p>
-    <w:p/>
-    <w:p>
-      <w:pPr>
-        <w:pStyle w:val="ListParagraph"/>
-        <w:numPr>
-          <w:ilvl w:val="0"/>
-          <w:numId w:val="1"/>
-        </w:numPr>
-      </w:pPr>
-      <w:r>
+        <w:rPr>
+          <w:sz w:val="20"/>
+          <w:szCs w:val="20"/>
+        </w:rPr>
         <w:t>Next Task</w:t>
       </w:r>
     </w:p>
     <w:p>
+      <w:pPr>
+        <w:rPr>
+          <w:sz w:val="20"/>
+          <w:szCs w:val="20"/>
+        </w:rPr>
+      </w:pPr>
       <w:r>
-        <w:t>Improve button functionality and add more interactive features.</w:t>
+        <w:rPr>
+          <w:sz w:val="20"/>
+          <w:szCs w:val="20"/>
+        </w:rPr>
+        <w:t xml:space="preserve">                 Improve designs </w:t>
       </w:r>
     </w:p>
     <w:sectPr>
-      <w:pgSz w:w="11906" w:h="16838"/>
-      <w:pgMar w:top="1440" w:right="1440" w:bottom="1440" w:left="1440" w:header="708" w:footer="708" w:gutter="0"/>
-      <w:cols w:space="708"/>
+      <w:pgSz w:w="12240" w:h="15840"/>
+      <w:pgMar w:top="1440" w:right="1440" w:bottom="1440" w:left="1440" w:header="720" w:footer="720" w:gutter="0"/>
+      <w:cols w:space="720"/>
       <w:docGrid w:linePitch="360"/>
     </w:sectPr>
   </w:body>
@@ -104,119 +200,92 @@
 <file path=word/numbering.xml><?xml version="1.0" encoding="utf-8"?>
 <w:numbering xmlns:wpc="http://schemas.microsoft.com/office/word/2010/wordprocessingCanvas" xmlns:cx="http://schemas.microsoft.com/office/drawing/2014/chartex" xmlns:cx1="http://schemas.microsoft.com/office/drawing/2015/9/8/chartex" xmlns:cx2="http://schemas.microsoft.com/office/drawing/2015/10/21/chartex" xmlns:cx3="http://schemas.microsoft.com/office/drawing/2016/5/9/chartex" xmlns:cx4="http://schemas.microsoft.com/office/drawing/2016/5/10/chartex" xmlns:cx5="http://schemas.microsoft.com/office/drawing/2016/5/11/chartex" xmlns:cx6="http://schemas.microsoft.com/office/drawing/2016/5/12/chartex" xmlns:cx7="http://schemas.microsoft.com/office/drawing/2016/5/13/chartex" xmlns:cx8="http://schemas.microsoft.com/office/drawing/2016/5/14/chartex" xmlns:mc="http://schemas.openxmlformats.org/markup-compatibility/2006" xmlns:aink="http://schemas.microsoft.com/office/drawing/2016/ink" xmlns:am3d="http://schemas.microsoft.com/office/drawing/2017/model3d" xmlns:o="urn:schemas-microsoft-com:office:office" xmlns:oel="http://schemas.microsoft.com/office/2019/extlst" xmlns:r="http://schemas.openxmlformats.org/officeDocument/2006/relationships" xmlns:m="http://schemas.openxmlformats.org/officeDocument/2006/math" xmlns:v="urn:schemas-microsoft-com:vml" xmlns:wp14="http://schemas.microsoft.com/office/word/2010/wordprocessingDrawing" xmlns:wp="http://schemas.openxmlformats.org/drawingml/2006/wordprocessingDrawing" xmlns:w10="urn:schemas-microsoft-com:office:word" xmlns:w="http://schemas.openxmlformats.org/wordprocessingml/2006/main" xmlns:w14="http://schemas.microsoft.com/office/word/2010/wordml" xmlns:w15="http://schemas.microsoft.com/office/word/2012/wordml" xmlns:w16cex="http://schemas.microsoft.com/office/word/2018/wordml/cex" xmlns:w16cid="http://schemas.microsoft.com/office/word/2016/wordml/cid" xmlns:w16="http://schemas.microsoft.com/office/word/2018/wordml" xmlns:w16du="http://schemas.microsoft.com/office/word/2023/wordml/word16du" xmlns:w16sdtdh="http://schemas.microsoft.com/office/word/2020/wordml/sdtdatahash" xmlns:w16sdtfl="http://schemas.microsoft.com/office/word/2024/wordml/sdtformatlock" xmlns:w16se="http://schemas.microsoft.com/office/word/2015/wordml/symex" xmlns:wpg="http://schemas.microsoft.com/office/word/2010/wordprocessingGroup" xmlns:wpi="http://schemas.microsoft.com/office/word/2010/wordprocessingInk" xmlns:wne="http://schemas.microsoft.com/office/word/2006/wordml" xmlns:wps="http://schemas.microsoft.com/office/word/2010/wordprocessingShape" mc:Ignorable="w14 w15 w16se w16cid w16 w16cex w16sdtdh w16sdtfl w16du wp14">
   <w:abstractNum w:abstractNumId="0" w15:restartNumberingAfterBreak="0">
-    <w:nsid w:val="45713FEF"/>
+    <w:nsid w:val="4CB159CF"/>
     <w:multiLevelType w:val="hybridMultilevel"/>
-    <w:tmpl w:val="BF047500"/>
-    <w:lvl w:ilvl="0" w:tplc="08090001">
+    <w:tmpl w:val="2556B8EC"/>
+    <w:lvl w:ilvl="0" w:tplc="0409000F">
       <w:start w:val="1"/>
-      <w:numFmt w:val="bullet"/>
-      <w:lvlText w:val=""/>
+      <w:numFmt w:val="decimal"/>
+      <w:lvlText w:val="%1."/>
       <w:lvlJc w:val="left"/>
       <w:pPr>
-        <w:ind w:left="720" w:hanging="360"/>
-      </w:pPr>
-      <w:rPr>
-        <w:rFonts w:ascii="Symbol" w:hAnsi="Symbol" w:hint="default"/>
-      </w:rPr>
+        <w:ind w:left="764" w:hanging="360"/>
+      </w:pPr>
     </w:lvl>
-    <w:lvl w:ilvl="1" w:tplc="08090003" w:tentative="1">
+    <w:lvl w:ilvl="1" w:tplc="04090019" w:tentative="1">
       <w:start w:val="1"/>
-      <w:numFmt w:val="bullet"/>
-      <w:lvlText w:val="o"/>
+      <w:numFmt w:val="lowerLetter"/>
+      <w:lvlText w:val="%2."/>
       <w:lvlJc w:val="left"/>
       <w:pPr>
-        <w:ind w:left="1440" w:hanging="360"/>
-      </w:pPr>
-      <w:rPr>
-        <w:rFonts w:ascii="Courier New" w:hAnsi="Courier New" w:cs="Courier New" w:hint="default"/>
-      </w:rPr>
+        <w:ind w:left="1484" w:hanging="360"/>
+      </w:pPr>
     </w:lvl>
-    <w:lvl w:ilvl="2" w:tplc="08090005" w:tentative="1">
+    <w:lvl w:ilvl="2" w:tplc="0409001B" w:tentative="1">
       <w:start w:val="1"/>
-      <w:numFmt w:val="bullet"/>
-      <w:lvlText w:val=""/>
+      <w:numFmt w:val="lowerRoman"/>
+      <w:lvlText w:val="%3."/>
+      <w:lvlJc w:val="right"/>
+      <w:pPr>
+        <w:ind w:left="2204" w:hanging="180"/>
+      </w:pPr>
+    </w:lvl>
+    <w:lvl w:ilvl="3" w:tplc="0409000F" w:tentative="1">
+      <w:start w:val="1"/>
+      <w:numFmt w:val="decimal"/>
+      <w:lvlText w:val="%4."/>
       <w:lvlJc w:val="left"/>
       <w:pPr>
-        <w:ind w:left="2160" w:hanging="360"/>
-      </w:pPr>
-      <w:rPr>
-        <w:rFonts w:ascii="Wingdings" w:hAnsi="Wingdings" w:hint="default"/>
-      </w:rPr>
+        <w:ind w:left="2924" w:hanging="360"/>
+      </w:pPr>
     </w:lvl>
-    <w:lvl w:ilvl="3" w:tplc="08090001" w:tentative="1">
+    <w:lvl w:ilvl="4" w:tplc="04090019" w:tentative="1">
       <w:start w:val="1"/>
-      <w:numFmt w:val="bullet"/>
-      <w:lvlText w:val=""/>
+      <w:numFmt w:val="lowerLetter"/>
+      <w:lvlText w:val="%5."/>
       <w:lvlJc w:val="left"/>
       <w:pPr>
-        <w:ind w:left="2880" w:hanging="360"/>
-      </w:pPr>
-      <w:rPr>
-        <w:rFonts w:ascii="Symbol" w:hAnsi="Symbol" w:hint="default"/>
-      </w:rPr>
+        <w:ind w:left="3644" w:hanging="360"/>
+      </w:pPr>
     </w:lvl>
-    <w:lvl w:ilvl="4" w:tplc="08090003" w:tentative="1">
+    <w:lvl w:ilvl="5" w:tplc="0409001B" w:tentative="1">
       <w:start w:val="1"/>
-      <w:numFmt w:val="bullet"/>
-      <w:lvlText w:val="o"/>
+      <w:numFmt w:val="lowerRoman"/>
+      <w:lvlText w:val="%6."/>
+      <w:lvlJc w:val="right"/>
+      <w:pPr>
+        <w:ind w:left="4364" w:hanging="180"/>
+      </w:pPr>
+    </w:lvl>
+    <w:lvl w:ilvl="6" w:tplc="0409000F" w:tentative="1">
+      <w:start w:val="1"/>
+      <w:numFmt w:val="decimal"/>
+      <w:lvlText w:val="%7."/>
       <w:lvlJc w:val="left"/>
       <w:pPr>
-        <w:ind w:left="3600" w:hanging="360"/>
-      </w:pPr>
-      <w:rPr>
-        <w:rFonts w:ascii="Courier New" w:hAnsi="Courier New" w:cs="Courier New" w:hint="default"/>
-      </w:rPr>
+        <w:ind w:left="5084" w:hanging="360"/>
+      </w:pPr>
     </w:lvl>
-    <w:lvl w:ilvl="5" w:tplc="08090005" w:tentative="1">
+    <w:lvl w:ilvl="7" w:tplc="04090019" w:tentative="1">
       <w:start w:val="1"/>
-      <w:numFmt w:val="bullet"/>
-      <w:lvlText w:val=""/>
+      <w:numFmt w:val="lowerLetter"/>
+      <w:lvlText w:val="%8."/>
       <w:lvlJc w:val="left"/>
       <w:pPr>
-        <w:ind w:left="4320" w:hanging="360"/>
-      </w:pPr>
-      <w:rPr>
-        <w:rFonts w:ascii="Wingdings" w:hAnsi="Wingdings" w:hint="default"/>
-      </w:rPr>
+        <w:ind w:left="5804" w:hanging="360"/>
+      </w:pPr>
     </w:lvl>
-    <w:lvl w:ilvl="6" w:tplc="08090001" w:tentative="1">
+    <w:lvl w:ilvl="8" w:tplc="0409001B" w:tentative="1">
       <w:start w:val="1"/>
-      <w:numFmt w:val="bullet"/>
-      <w:lvlText w:val=""/>
-      <w:lvlJc w:val="left"/>
-      <w:pPr>
-        <w:ind w:left="5040" w:hanging="360"/>
-      </w:pPr>
-      <w:rPr>
-        <w:rFonts w:ascii="Symbol" w:hAnsi="Symbol" w:hint="default"/>
-      </w:rPr>
-    </w:lvl>
-    <w:lvl w:ilvl="7" w:tplc="08090003" w:tentative="1">
-      <w:start w:val="1"/>
-      <w:numFmt w:val="bullet"/>
-      <w:lvlText w:val="o"/>
-      <w:lvlJc w:val="left"/>
-      <w:pPr>
-        <w:ind w:left="5760" w:hanging="360"/>
-      </w:pPr>
-      <w:rPr>
-        <w:rFonts w:ascii="Courier New" w:hAnsi="Courier New" w:cs="Courier New" w:hint="default"/>
-      </w:rPr>
-    </w:lvl>
-    <w:lvl w:ilvl="8" w:tplc="08090005" w:tentative="1">
-      <w:start w:val="1"/>
-      <w:numFmt w:val="bullet"/>
-      <w:lvlText w:val=""/>
-      <w:lvlJc w:val="left"/>
-      <w:pPr>
-        <w:ind w:left="6480" w:hanging="360"/>
-      </w:pPr>
-      <w:rPr>
-        <w:rFonts w:ascii="Wingdings" w:hAnsi="Wingdings" w:hint="default"/>
-      </w:rPr>
+      <w:numFmt w:val="lowerRoman"/>
+      <w:lvlText w:val="%9."/>
+      <w:lvlJc w:val="right"/>
+      <w:pPr>
+        <w:ind w:left="6524" w:hanging="180"/>
+      </w:pPr>
     </w:lvl>
   </w:abstractNum>
-  <w:num w:numId="1" w16cid:durableId="1511336463">
+  <w:num w:numId="1" w16cid:durableId="1746143330">
     <w:abstractNumId w:val="0"/>
   </w:num>
 </w:numbering>
@@ -231,7 +300,7 @@
         <w:kern w:val="2"/>
         <w:sz w:val="24"/>
         <w:szCs w:val="24"/>
-        <w:lang w:val="en-GB" w:eastAsia="en-US" w:bidi="ar-SA"/>
+        <w:lang w:val="en-US" w:eastAsia="en-US" w:bidi="ar-SA"/>
         <w14:ligatures w14:val="standardContextual"/>
       </w:rPr>
     </w:rPrDefault>
@@ -630,7 +699,7 @@
     <w:link w:val="Heading1Char"/>
     <w:uiPriority w:val="9"/>
     <w:qFormat/>
-    <w:rsid w:val="00E72FD6"/>
+    <w:rsid w:val="004E6559"/>
     <w:pPr>
       <w:keepNext/>
       <w:keepLines/>
@@ -653,7 +722,7 @@
     <w:semiHidden/>
     <w:unhideWhenUsed/>
     <w:qFormat/>
-    <w:rsid w:val="00E72FD6"/>
+    <w:rsid w:val="004E6559"/>
     <w:pPr>
       <w:keepNext/>
       <w:keepLines/>
@@ -676,7 +745,7 @@
     <w:semiHidden/>
     <w:unhideWhenUsed/>
     <w:qFormat/>
-    <w:rsid w:val="00E72FD6"/>
+    <w:rsid w:val="004E6559"/>
     <w:pPr>
       <w:keepNext/>
       <w:keepLines/>
@@ -699,7 +768,7 @@
     <w:semiHidden/>
     <w:unhideWhenUsed/>
     <w:qFormat/>
-    <w:rsid w:val="00E72FD6"/>
+    <w:rsid w:val="004E6559"/>
     <w:pPr>
       <w:keepNext/>
       <w:keepLines/>
@@ -722,7 +791,7 @@
     <w:semiHidden/>
     <w:unhideWhenUsed/>
     <w:qFormat/>
-    <w:rsid w:val="00E72FD6"/>
+    <w:rsid w:val="004E6559"/>
     <w:pPr>
       <w:keepNext/>
       <w:keepLines/>
@@ -743,7 +812,7 @@
     <w:semiHidden/>
     <w:unhideWhenUsed/>
     <w:qFormat/>
-    <w:rsid w:val="00E72FD6"/>
+    <w:rsid w:val="004E6559"/>
     <w:pPr>
       <w:keepNext/>
       <w:keepLines/>
@@ -766,7 +835,7 @@
     <w:semiHidden/>
     <w:unhideWhenUsed/>
     <w:qFormat/>
-    <w:rsid w:val="00E72FD6"/>
+    <w:rsid w:val="004E6559"/>
     <w:pPr>
       <w:keepNext/>
       <w:keepLines/>
@@ -787,7 +856,7 @@
     <w:semiHidden/>
     <w:unhideWhenUsed/>
     <w:qFormat/>
-    <w:rsid w:val="00E72FD6"/>
+    <w:rsid w:val="004E6559"/>
     <w:pPr>
       <w:keepNext/>
       <w:keepLines/>
@@ -810,7 +879,7 @@
     <w:semiHidden/>
     <w:unhideWhenUsed/>
     <w:qFormat/>
-    <w:rsid w:val="00E72FD6"/>
+    <w:rsid w:val="004E6559"/>
     <w:pPr>
       <w:keepNext/>
       <w:keepLines/>
@@ -854,7 +923,7 @@
     <w:basedOn w:val="DefaultParagraphFont"/>
     <w:link w:val="Heading1"/>
     <w:uiPriority w:val="9"/>
-    <w:rsid w:val="00E72FD6"/>
+    <w:rsid w:val="004E6559"/>
     <w:rPr>
       <w:rFonts w:asciiTheme="majorHAnsi" w:eastAsiaTheme="majorEastAsia" w:hAnsiTheme="majorHAnsi" w:cstheme="majorBidi"/>
       <w:color w:val="0F4761" w:themeColor="accent1" w:themeShade="BF"/>
@@ -868,7 +937,7 @@
     <w:link w:val="Heading2"/>
     <w:uiPriority w:val="9"/>
     <w:semiHidden/>
-    <w:rsid w:val="00E72FD6"/>
+    <w:rsid w:val="004E6559"/>
     <w:rPr>
       <w:rFonts w:asciiTheme="majorHAnsi" w:eastAsiaTheme="majorEastAsia" w:hAnsiTheme="majorHAnsi" w:cstheme="majorBidi"/>
       <w:color w:val="0F4761" w:themeColor="accent1" w:themeShade="BF"/>
@@ -882,7 +951,7 @@
     <w:link w:val="Heading3"/>
     <w:uiPriority w:val="9"/>
     <w:semiHidden/>
-    <w:rsid w:val="00E72FD6"/>
+    <w:rsid w:val="004E6559"/>
     <w:rPr>
       <w:rFonts w:eastAsiaTheme="majorEastAsia" w:cstheme="majorBidi"/>
       <w:color w:val="0F4761" w:themeColor="accent1" w:themeShade="BF"/>
@@ -896,7 +965,7 @@
     <w:link w:val="Heading4"/>
     <w:uiPriority w:val="9"/>
     <w:semiHidden/>
-    <w:rsid w:val="00E72FD6"/>
+    <w:rsid w:val="004E6559"/>
     <w:rPr>
       <w:rFonts w:eastAsiaTheme="majorEastAsia" w:cstheme="majorBidi"/>
       <w:i/>
@@ -910,7 +979,7 @@
     <w:link w:val="Heading5"/>
     <w:uiPriority w:val="9"/>
     <w:semiHidden/>
-    <w:rsid w:val="00E72FD6"/>
+    <w:rsid w:val="004E6559"/>
     <w:rPr>
       <w:rFonts w:eastAsiaTheme="majorEastAsia" w:cstheme="majorBidi"/>
       <w:color w:val="0F4761" w:themeColor="accent1" w:themeShade="BF"/>
@@ -922,7 +991,7 @@
     <w:link w:val="Heading6"/>
     <w:uiPriority w:val="9"/>
     <w:semiHidden/>
-    <w:rsid w:val="00E72FD6"/>
+    <w:rsid w:val="004E6559"/>
     <w:rPr>
       <w:rFonts w:eastAsiaTheme="majorEastAsia" w:cstheme="majorBidi"/>
       <w:i/>
@@ -936,7 +1005,7 @@
     <w:link w:val="Heading7"/>
     <w:uiPriority w:val="9"/>
     <w:semiHidden/>
-    <w:rsid w:val="00E72FD6"/>
+    <w:rsid w:val="004E6559"/>
     <w:rPr>
       <w:rFonts w:eastAsiaTheme="majorEastAsia" w:cstheme="majorBidi"/>
       <w:color w:val="595959" w:themeColor="text1" w:themeTint="A6"/>
@@ -948,7 +1017,7 @@
     <w:link w:val="Heading8"/>
     <w:uiPriority w:val="9"/>
     <w:semiHidden/>
-    <w:rsid w:val="00E72FD6"/>
+    <w:rsid w:val="004E6559"/>
     <w:rPr>
       <w:rFonts w:eastAsiaTheme="majorEastAsia" w:cstheme="majorBidi"/>
       <w:i/>
@@ -962,7 +1031,7 @@
     <w:link w:val="Heading9"/>
     <w:uiPriority w:val="9"/>
     <w:semiHidden/>
-    <w:rsid w:val="00E72FD6"/>
+    <w:rsid w:val="004E6559"/>
     <w:rPr>
       <w:rFonts w:eastAsiaTheme="majorEastAsia" w:cstheme="majorBidi"/>
       <w:color w:val="272727" w:themeColor="text1" w:themeTint="D8"/>
@@ -975,7 +1044,7 @@
     <w:link w:val="TitleChar"/>
     <w:uiPriority w:val="10"/>
     <w:qFormat/>
-    <w:rsid w:val="00E72FD6"/>
+    <w:rsid w:val="004E6559"/>
     <w:pPr>
       <w:spacing w:after="80" w:line="240" w:lineRule="auto"/>
       <w:contextualSpacing/>
@@ -993,7 +1062,7 @@
     <w:basedOn w:val="DefaultParagraphFont"/>
     <w:link w:val="Title"/>
     <w:uiPriority w:val="10"/>
-    <w:rsid w:val="00E72FD6"/>
+    <w:rsid w:val="004E6559"/>
     <w:rPr>
       <w:rFonts w:asciiTheme="majorHAnsi" w:eastAsiaTheme="majorEastAsia" w:hAnsiTheme="majorHAnsi" w:cstheme="majorBidi"/>
       <w:spacing w:val="-10"/>
@@ -1009,7 +1078,7 @@
     <w:link w:val="SubtitleChar"/>
     <w:uiPriority w:val="11"/>
     <w:qFormat/>
-    <w:rsid w:val="00E72FD6"/>
+    <w:rsid w:val="004E6559"/>
     <w:pPr>
       <w:numPr>
         <w:ilvl w:val="1"/>
@@ -1028,7 +1097,7 @@
     <w:basedOn w:val="DefaultParagraphFont"/>
     <w:link w:val="Subtitle"/>
     <w:uiPriority w:val="11"/>
-    <w:rsid w:val="00E72FD6"/>
+    <w:rsid w:val="004E6559"/>
     <w:rPr>
       <w:rFonts w:eastAsiaTheme="majorEastAsia" w:cstheme="majorBidi"/>
       <w:color w:val="595959" w:themeColor="text1" w:themeTint="A6"/>
@@ -1044,7 +1113,7 @@
     <w:link w:val="QuoteChar"/>
     <w:uiPriority w:val="29"/>
     <w:qFormat/>
-    <w:rsid w:val="00E72FD6"/>
+    <w:rsid w:val="004E6559"/>
     <w:pPr>
       <w:spacing w:before="160"/>
       <w:jc w:val="center"/>
@@ -1060,7 +1129,7 @@
     <w:basedOn w:val="DefaultParagraphFont"/>
     <w:link w:val="Quote"/>
     <w:uiPriority w:val="29"/>
-    <w:rsid w:val="00E72FD6"/>
+    <w:rsid w:val="004E6559"/>
     <w:rPr>
       <w:i/>
       <w:iCs/>
@@ -1072,7 +1141,7 @@
     <w:basedOn w:val="Normal"/>
     <w:uiPriority w:val="34"/>
     <w:qFormat/>
-    <w:rsid w:val="00E72FD6"/>
+    <w:rsid w:val="004E6559"/>
     <w:pPr>
       <w:ind w:left="720"/>
       <w:contextualSpacing/>
@@ -1083,7 +1152,7 @@
     <w:basedOn w:val="DefaultParagraphFont"/>
     <w:uiPriority w:val="21"/>
     <w:qFormat/>
-    <w:rsid w:val="00E72FD6"/>
+    <w:rsid w:val="004E6559"/>
     <w:rPr>
       <w:i/>
       <w:iCs/>
@@ -1097,7 +1166,7 @@
     <w:link w:val="IntenseQuoteChar"/>
     <w:uiPriority w:val="30"/>
     <w:qFormat/>
-    <w:rsid w:val="00E72FD6"/>
+    <w:rsid w:val="004E6559"/>
     <w:pPr>
       <w:pBdr>
         <w:top w:val="single" w:sz="4" w:space="10" w:color="0F4761" w:themeColor="accent1" w:themeShade="BF"/>
@@ -1118,7 +1187,7 @@
     <w:basedOn w:val="DefaultParagraphFont"/>
     <w:link w:val="IntenseQuote"/>
     <w:uiPriority w:val="30"/>
-    <w:rsid w:val="00E72FD6"/>
+    <w:rsid w:val="004E6559"/>
     <w:rPr>
       <w:i/>
       <w:iCs/>
@@ -1130,7 +1199,7 @@
     <w:basedOn w:val="DefaultParagraphFont"/>
     <w:uiPriority w:val="32"/>
     <w:qFormat/>
-    <w:rsid w:val="00E72FD6"/>
+    <w:rsid w:val="004E6559"/>
     <w:rPr>
       <w:b/>
       <w:bCs/>

</xml_diff>